<commit_message>
feat(thesis): English cover for thesis-en.docx
- build.py rebuild_title_page() parameterized (author/title/shifri/org lines);
  Georgian values remain the defaults, so the Georgian cover is unchanged
- build_en.py passes the English cover: title "Conversational AI: The
  Evolution from Assistant to Interlocutor", author romanized, "Code: 0163",
  "Georgian Technical University", "Tbilisi, 0160, Georgia", "July 2026"
- Georgian front-matter pages (recommendation, commission, რეზიუმე) stay Georgian

Co-Authored-By: Claude Opus 4.8 (1M context) <noreply@anthropic.com>
</commit_message>
<xml_diff>
--- a/project/thesis-en.docx
+++ b/project/thesis-en.docx
@@ -58,9 +58,9 @@
           <w:rFonts w:ascii="Sylfaen" w:hAnsi="Sylfaen" w:cs="Sylfaen"/>
           <w:b/>
           <w:sz w:val="24"/>
-          <w:lang w:val="ka-GE"/>
-        </w:rPr>
-        <w:t>ალექსანდრე იმნაიშვილი</w:t>
+          <w:lang w:val="en-US"/>
+        </w:rPr>
+        <w:t>Aleksandre Imnaishvili</w:t>
       </w:r>
     </w:p>
     <w:p>
@@ -79,9 +79,9 @@
           <w:rFonts w:ascii="Sylfaen" w:hAnsi="Sylfaen" w:cs="Sylfaen"/>
           <w:b/>
           <w:sz w:val="32"/>
-          <w:lang w:val="ka-GE"/>
-        </w:rPr>
-        <w:t>სასაუბრო ხელოვნური ინტელექტი: ასისტენტიდან თანამოსაუბრემდე ევოლუცია</w:t>
+          <w:lang w:val="en-US"/>
+        </w:rPr>
+        <w:t>Conversational AI: The Evolution from Assistant to Interlocutor</w:t>
       </w:r>
     </w:p>
     <w:p>
@@ -100,9 +100,9 @@
           <w:rFonts w:ascii="Sylfaen" w:hAnsi="Sylfaen" w:cs="Sylfaen"/>
           <w:b/>
           <w:sz w:val="28"/>
-          <w:lang w:val="ka-GE"/>
-        </w:rPr>
-        <w:t>შიფრი: 0163</w:t>
+          <w:lang w:val="en-US"/>
+        </w:rPr>
+        <w:t>Code: 0163</w:t>
       </w:r>
     </w:p>
     <w:p>
@@ -127,9 +127,9 @@
           <w:rFonts w:ascii="Sylfaen" w:hAnsi="Sylfaen" w:cs="Sylfaen"/>
           <w:b w:val="0"/>
           <w:sz w:val="24"/>
-          <w:lang w:val="ka-GE"/>
-        </w:rPr>
-        <w:t>საქართველოს ტექნიკური უნივერსიტეტი</w:t>
+          <w:lang w:val="en-US"/>
+        </w:rPr>
+        <w:t>Georgian Technical University</w:t>
       </w:r>
     </w:p>
     <w:p>
@@ -142,9 +142,9 @@
           <w:rFonts w:ascii="Sylfaen" w:hAnsi="Sylfaen" w:cs="Sylfaen"/>
           <w:b w:val="0"/>
           <w:sz w:val="24"/>
-          <w:lang w:val="ka-GE"/>
-        </w:rPr>
-        <w:t>თბილისი, 0160, საქართველო</w:t>
+          <w:lang w:val="en-US"/>
+        </w:rPr>
+        <w:t>Tbilisi, 0160, Georgia</w:t>
       </w:r>
     </w:p>
     <w:p>
@@ -157,9 +157,9 @@
           <w:rFonts w:ascii="Sylfaen" w:hAnsi="Sylfaen" w:cs="Sylfaen"/>
           <w:b w:val="0"/>
           <w:sz w:val="24"/>
-          <w:lang w:val="ka-GE"/>
-        </w:rPr>
-        <w:t>ივლისი, 2026 წელი</w:t>
+          <w:lang w:val="en-US"/>
+        </w:rPr>
+        <w:t>July 2026</w:t>
       </w:r>
     </w:p>
     <w:p>

</xml_diff>

<commit_message>
style(thesis-en): mirror abstracts — English in რეზიუმე, Georgian in Abstract
The English edition now leads with the English abstract (რეზიუმე slot =
this edition's primary language) and carries the Georgian abstract in the
second "Abstract" slot — the vice-versa of the Georgian edition. The
trailing-spacer cleanup is retargeted to the last keywords line (now the
Georgian საკვანძო) to keep front-matter pagination clean.

Co-Authored-By: Claude Opus 4.8 (1M context) <noreply@anthropic.com>
</commit_message>
<xml_diff>
--- a/project/thesis-en.docx
+++ b/project/thesis-en.docx
@@ -971,9 +971,9 @@
           <w:rFonts w:ascii="Sylfaen" w:hAnsi="Sylfaen" w:cs="Sylfaen"/>
           <w:b w:val="0"/>
           <w:sz w:val="24"/>
-          <w:lang w:val="ka-GE"/>
-        </w:rPr>
-        <w:t>დიდი ენობრივი მოდელების საფუძველზე შექმნილი საუბრის სისტემები ერთ სესიაზე ადამიანის დონის თავისუფლებას აღწევენ, მაგრამ სესიებს შორის ვერ ინარჩუნებენ უწყვეტ, განვითარებად ურთიერთობას, რადგან მათ არ გააჩნიათ მდგრადი გრძელვადიანი მეხსიერება. გრძელვადიანი მეხსიერების ბენჩმარკებისა და ეგრეთ წოდებული "კომპანიონი" აპლიკაციების მომხმარებლების მონაცემები მიუთითებს, რომ ეს წარუმატებლობა არის როგორც ტექნიკური — მოდელები ადამიანის მეხსიერებას მნიშვნელოვნად ჩამორჩებიან, განსაკუთრებით დროითი (ტემპორალური) მსჯელობისას — ასევე ურთიერთობრივი, რადგან მეხსიერების დეფექტები და იდენტობის მკვეთრი შეწყვეტა დოკუმენტურად არღვევს მომხმარებლის მიერ აღქმულ ურთიერთობას. თუმცა, პრობლემასთან დაკავშირებული ორი დისციპლინა განცალკევებით არსებობს: მეხსიერების არქიტექტურები შეფასდება ფაქტობრივი სიზუსტის კრიტერიუმებით, მაშინ როდესაც ურთიერთობის აღქმის კვლევები მეხსიერებას განიხილავენ, როგორც ერთჯერად ჩართვა-გამორთვას ერთი სისტემის ფარგლებში. ჩვენთვის ხელმისაწვდომ ლიტერატურაში არ არსებობს არც ერთი კონტროლირებადი კვლევა, რომელიც სხვადასხვა ადამიანური მეხსიერების თეორიაზე დაფუძნებული მეხსიერების არქიტექტურების შედარებას ახდენს მომხმარებლის მიერ აღქმული სოციალური კონსტრუქტების მიხედვით და არც ერთი მათგანი არ ათავსებს ასეთ შედარებას ხმოვან მოდალობაში.</w:t>
+          <w:lang w:val="en-US"/>
+        </w:rPr>
+        <w:t>Conversational systems built on large language models achieve human-comparable fluency within a single session but fail to sustain a continuous, evolving relationship across sessions, because they lack durable long-term memory. Evidence from long-term-memory benchmarks and from users of so-called "companion" applications indicates that this failure is both technical — models lag human recall by wide margins, worst of all on temporal reasoning — and relational, in that memory failure and abrupt identity discontinuity are documented to break a user's sense of relationship. Yet the two literatures that bear on the problem remain separate: memory architectures are evaluated on factual-accuracy metrics, while studies of perceived relationship treat memory as a single on/off manipulation on one system. In the literature available to us, no controlled study compares memory architectures grounded in different human-memory theories with respect to user-perceived social constructs, and none situates such a comparison in the voice modality.</w:t>
       </w:r>
     </w:p>
     <w:p>
@@ -986,9 +986,9 @@
           <w:rFonts w:ascii="Sylfaen" w:hAnsi="Sylfaen" w:cs="Sylfaen"/>
           <w:b w:val="0"/>
           <w:sz w:val="24"/>
-          <w:lang w:val="ka-GE"/>
-        </w:rPr>
-        <w:t>ეს ნაშრომი ამ ხარვეზს დიზაინის, იმპლემენტაციისა და შეფასების მეთოდოლოგიის მეშვეობით ავსებს. ის წარმოადგენს Profile C-ს, ხმოვანი თანამოსაუბრის გრძელვადიანი მეხსიერების არქიტექტურას, რომელიც აერთიანებს ხუთ კოგნიტურ-მეხსიერების თეორიას — ატკინსონ-შიფრინის მრავალსაცავიანი მოდელი, ებინგჰაუსის დავიწყების მრუდი, ტულვინგის ეპიზოდურ-სემანტიკური განასხვავება, ბუნდოვანი კვალით თეორია და დამატებითი სასწავლო სისტემების ჩარჩო — ერთ სასიცოცხლო ციკლში: მნიშვნელობისმიღწევით კონტროლირებადი კოდირება, არსებითი ნაწილისა და ორიენტირის წარმოდგენა, გაჭიანურებული ებინგჰაუსის დაშლა დროში გადანაწილებული გამეორებით გაძლიერებისას, ოფლაინ ეპიზოდურიდან სემანტიკურზე კონსოლიდაცია და არსებითი ნაწილის მიხედვით მოძიება. თითოეული მექანიზმი დაკავშირებულია დასაკვირვებელ ქცევით ხელმოწერასთან და არა ფსიქოლოგიური სიზუსტის მტკიცებასთან.</w:t>
+          <w:lang w:val="en-US"/>
+        </w:rPr>
+        <w:t>This thesis addresses that gap through design, implementation, and evaluation methodology. It presents Profile C, a long-term memory architecture for a voice interlocutor that composes five cognitive-memory theories — the Atkinson–Shiffrin multi-store model, the Ebbinghaus forgetting curve, Tulving's episodic–semantic distinction, fuzzy-trace theory, and the complementary learning systems framework — into one lifecycle: salience-gated encoding, gist-and-anchor representation, lazy Ebbinghaus decay with spaced-repetition reinforcement, offline episodic-to-semantic consolidation, and gist-first retrieval. Each mechanism is tied to an observable behavioral signature rather than to a claim of psychological fidelity.</w:t>
       </w:r>
     </w:p>
     <w:p>
@@ -1001,9 +1001,9 @@
           <w:rFonts w:ascii="Sylfaen" w:hAnsi="Sylfaen" w:cs="Sylfaen"/>
           <w:b w:val="0"/>
           <w:sz w:val="24"/>
-          <w:lang w:val="ka-GE"/>
-        </w:rPr>
-        <w:t>მთავარი მეთოდოლოგიური წვლილი კურატორირებაზე კონტროლირებადი ექსპერიმენტული დიზაინია. პროფილი C შედარებულია არა მხოლოდ უმეხსიერებო საწყისთან (A) და სიტყვასიტყვითი აღდგენით გაძლიერებულ მეხსიერებასთან (B), არამედ აქტიურ კონტროლთან, B+, რომელიც იღებს იმავე ოფლაინ ენობრივი მოდელის აზრთა არსის გამოყოფასა და გაწმენდას, რასაც C, მაგრამ არ იღებს ადამიანის მეხსიერების დინამიკის არცერთ ელემენტს — არც გახუნებას, არც მნიშვნელოვნების კარიბჭეს, არც კონსოლიდაციას. რადგან პირობებს ერთნაირი, ანალიზის დროის ჩარჩო აქვთ, B+ კონტროლი გამოყოფს ადამიანის მეხსიერების დინამიკის ეფექტს ენობრივი მოდელის კურატორირებით მიღებული ზოგადი წაკითხვადობის გაუმჯობესებისგან — იმ არეულობისგან, რომელიც სხვა შემთხვევაში "ადამიანის მსგავსი" მეხსიერების ნებისმიერ უპირატესობას გაუგებარს გახდიდა. ა-პრიორი ძალის ანალიზი აჩვენებს, რომ მიღებული ცენტრალური კონტრასტი, C B+-თან შედარებით, თავისი კონსტრუქციით, დიზაინში ყველაზე მცირე ეფექტია და არდასტურდება ამ კლასის კვლევისთვის ნორმატიული ნიმუშების რაოდენობით; შესაბამისად, ის წინასწარ არის რეგისტრირებული, როგორც შეფასების სამიზნე, და ზუსტად შეფასებული ნული ითვლება არსებით შედეგად, რომლის ინტერპრეტაციაც B+ კონტროლის მიერ მიზანმიმართულად იქნა უზრუნველყოფილი.</w:t>
+          <w:lang w:val="en-US"/>
+        </w:rPr>
+        <w:t>The central methodological contribution is a curation-controlled experimental design. Profile C is compared not only against a no-memory baseline (A) and verbatim retrieval-augmented memory (B), but against an active control, B+, which receives the same offline language-model gisting and cleanup as C yet none of its human-memory dynamics — no decay, no salience-gating, no consolidation. Because the conditions share an identical inference-time envelope, the B+ control isolates the effect of the human-memory dynamics from the generic legibility gains of language-model curation, the confound that would otherwise render any advantage of a "human-like" memory uninterpretable. An a-priori power analysis shows that the resulting central contrast, C versus B+, is by construction the smallest effect in the design and is not confirmable at the sample size normative for this class of study; it is therefore pre-registered as an estimation target, and a precisely-estimated null is treated as a substantive result that the B+ control was purpose-built to make interpretable.</w:t>
       </w:r>
     </w:p>
     <w:p>
@@ -1016,9 +1016,9 @@
           <w:rFonts w:ascii="Sylfaen" w:hAnsi="Sylfaen" w:cs="Sylfaen"/>
           <w:b w:val="0"/>
           <w:sz w:val="24"/>
-          <w:lang w:val="ka-GE"/>
-        </w:rPr>
-        <w:t>კონცეფციის დამტკიცების მექანიზმი მრავალსესიურ დიალოგებზე ყველა ოთხ პირობას ასრულებს და მისი შეფასება ტექნიკური და სიმულირებული მომხმარებლის მიმართულებით ხდება. ტექნიკურად, მექანიზმები ისე მუშაობს, როგორც დაპროექტდა, და ერთმანეთისგან განასხვავებადია: მხოლოდ პროფილი C ივიწყებს გამართულად და სელექციურად — ინარჩუნებს მნიშვნელოვან ფაქტებს, ხოლო უმნიშვნელო ინფორმაცია მივიწყებას მიეცემა — და მხოლოდ C აერთიანებს განმეორებად ეპიზოდებს მდგრად სემანტიკურ ცოდნედ, უფრო მცირე კონტექსტური კვალის ფასად და საბაზისო მაჩვენებლების მსგავსი შეყოვნებით. სიმულაციისას, პროფილი C არ აღემატება B+ კონტროლს არცერთ აღქმულ კონსტრუქტზე, რაც ადასტურებს პროგნოზს, რომ ადამიანის მეხსიერების დინამიკა სუფთა კურირებასთან შედარებით აღქმის მცირე დამატებით მარჟინს ქმნის. რაც ყველაზე მნიშვნელოვანია, იმ ერთ კონსტრუქტზე, რომელზეც ადამიანის გავლენა ძლიერი და გამეორებული იყო — სიტყვასიტყვითი გახსენების ინტრუზიულობა — სიმულაციურმა მსაჯულმა ადამიანთა ლიტერატურისგან საპირისპირო დალაგება წარმოადგინა, რითაც აჩვენა, რომ ენობრივი მოდელის მსაჯული ვერ ჩაანაცვლებს ადამიანის აღქმას მნიშვნელოვან შედეგებზე დამოკიდებულ კონსტრუქტებზე და, ამგვარად, დაამტკიცა ადამიანთა მონაწილეობით კვლევის აუცილებლობა, რომელსაც ნაშრომი სრულად განსაზღვრავს, როგორც მომავალ სამუშაოს.</w:t>
+          <w:lang w:val="en-US"/>
+        </w:rPr>
+        <w:t>A proof-of-concept harness implements all four conditions over multi-session dialogues and is evaluated on a technical and a simulated-user track. Technically, the mechanisms behave as designed and are distinguishable: only Profile C forgets gracefully and selectively — retaining salient facts while letting trivia fade — and only C consolidates recurring episodes into durable semantic knowledge, at a leaner context footprint and at latency parity with the baselines. In simulation, Profile C does not exceed the B+ control on any perceived construct, corroborating the prediction that human-memory dynamics add little perceptual margin over clean curation. Most consequentially, on the one construct with a strong replicated human effect — the intrusiveness of verbatim recall — the simulated judge produced the opposite ordering to the human literature, demonstrating that a language-model judge cannot substitute for human perception on stakes-dependent constructs, and thereby establishing the necessity of the human-subject study that the thesis fully specifies as future work.</w:t>
       </w:r>
     </w:p>
     <w:p>
@@ -1031,9 +1031,9 @@
           <w:rFonts w:ascii="Sylfaen" w:hAnsi="Sylfaen" w:cs="Sylfaen"/>
           <w:b w:val="0"/>
           <w:sz w:val="24"/>
-          <w:lang w:val="ka-GE"/>
-        </w:rPr>
-        <w:t>ნაშრომი წარმოადგენს კოგნიტურ-საფუძვლიან მეხსიერების არქიტექტურას, მეხსიერების დინამიკის კურატორირებული შინაარსისგან გამიჯვნის ხელახლა გამოყენებად მეთოდოლოგიას და ემპირიულ კონცეფციის დამამტკიცებელ მტკიცებულებას ორივესთვის — რაც ადამიანზე ორიენტირებულ შეფასებას წარმოაჩენს, როგორც მკაცრ, წინასწარ რეგისტრირებულ სამომავლო სამუშაოს.</w:t>
+          <w:lang w:val="en-US"/>
+        </w:rPr>
+        <w:t>The thesis contributes a cognitively-grounded memory architecture, a reusable curation-controlled methodology for separating memory dynamics from curation, and empirical proof-of-concept evidence for both — framing the human-subject evaluation as rigorous, pre-registered future work.</w:t>
       </w:r>
     </w:p>
     <w:p>
@@ -1045,9 +1045,9 @@
           <w:rFonts w:ascii="Sylfaen" w:hAnsi="Sylfaen" w:cs="Sylfaen"/>
           <w:b w:val="0"/>
           <w:sz w:val="24"/>
-          <w:lang w:val="ka-GE"/>
-        </w:rPr>
-        <w:t>საკვანძო სიტყვები: საუბრული ხელოვნური ინტელექტი, გრძელვადიანი მეხსიერება, ადამიანის მეხსიერების მოდელები, სოციალური თანდასწრება, ხმოვანი თანამოსაუბრე, შეფასების მეთოდოლოგია.</w:t>
+          <w:lang w:val="en-US"/>
+        </w:rPr>
+        <w:t>Keywords: conversational AI, long-term memory, human memory models, social presence, voice interlocutor, evaluation methodology.</w:t>
       </w:r>
     </w:p>
     <w:bookmarkEnd w:id="5"/>
@@ -1081,9 +1081,9 @@
           <w:rFonts w:ascii="Sylfaen" w:hAnsi="Sylfaen" w:cs="Sylfaen"/>
           <w:b w:val="0"/>
           <w:sz w:val="24"/>
-          <w:lang w:val="en-US"/>
-        </w:rPr>
-        <w:t>Conversational systems built on large language models achieve human-comparable fluency within a single session but fail to sustain a continuous, evolving relationship across sessions, because they lack durable long-term memory. Evidence from long-term-memory benchmarks and from users of so-called "companion" applications indicates that this failure is both technical — models lag human recall by wide margins, worst of all on temporal reasoning — and relational, in that memory failure and abrupt identity discontinuity are documented to break a user's sense of relationship. Yet the two literatures that bear on the problem remain separate: memory architectures are evaluated on factual-accuracy metrics, while studies of perceived relationship treat memory as a single on/off manipulation on one system. In the literature available to us, no controlled study compares memory architectures grounded in different human-memory theories with respect to user-perceived social constructs, and none situates such a comparison in the voice modality.</w:t>
+          <w:lang w:val="ka-GE"/>
+        </w:rPr>
+        <w:t>დიდი ენობრივი მოდელების საფუძველზე შექმნილი საუბრის სისტემები ერთ სესიაზე ადამიანის დონის თავისუფლებას აღწევენ, მაგრამ სესიებს შორის ვერ ინარჩუნებენ უწყვეტ, განვითარებად ურთიერთობას, რადგან მათ არ გააჩნიათ მდგრადი გრძელვადიანი მეხსიერება. გრძელვადიანი მეხსიერების ბენჩმარკებისა და ეგრეთ წოდებული "კომპანიონი" აპლიკაციების მომხმარებლების მონაცემები მიუთითებს, რომ ეს წარუმატებლობა არის როგორც ტექნიკური — მოდელები ადამიანის მეხსიერებას მნიშვნელოვნად ჩამორჩებიან, განსაკუთრებით დროითი (ტემპორალური) მსჯელობისას — ასევე ურთიერთობრივი, რადგან მეხსიერების დეფექტები და იდენტობის მკვეთრი შეწყვეტა დოკუმენტურად არღვევს მომხმარებლის მიერ აღქმულ ურთიერთობას. თუმცა, პრობლემასთან დაკავშირებული ორი დისციპლინა განცალკევებით არსებობს: მეხსიერების არქიტექტურები შეფასდება ფაქტობრივი სიზუსტის კრიტერიუმებით, მაშინ როდესაც ურთიერთობის აღქმის კვლევები მეხსიერებას განიხილავენ, როგორც ერთჯერად ჩართვა-გამორთვას ერთი სისტემის ფარგლებში. ჩვენთვის ხელმისაწვდომ ლიტერატურაში არ არსებობს არც ერთი კონტროლირებადი კვლევა, რომელიც სხვადასხვა ადამიანური მეხსიერების თეორიაზე დაფუძნებული მეხსიერების არქიტექტურების შედარებას ახდენს მომხმარებლის მიერ აღქმული სოციალური კონსტრუქტების მიხედვით და არც ერთი მათგანი არ ათავსებს ასეთ შედარებას ხმოვან მოდალობაში.</w:t>
       </w:r>
     </w:p>
     <w:p>
@@ -1096,9 +1096,9 @@
           <w:rFonts w:ascii="Sylfaen" w:hAnsi="Sylfaen" w:cs="Sylfaen"/>
           <w:b w:val="0"/>
           <w:sz w:val="24"/>
-          <w:lang w:val="en-US"/>
-        </w:rPr>
-        <w:t>This thesis addresses that gap through design, implementation, and evaluation methodology. It presents Profile C, a long-term memory architecture for a voice interlocutor that composes five cognitive-memory theories — the Atkinson–Shiffrin multi-store model, the Ebbinghaus forgetting curve, Tulving's episodic–semantic distinction, fuzzy-trace theory, and the complementary learning systems framework — into one lifecycle: salience-gated encoding, gist-and-anchor representation, lazy Ebbinghaus decay with spaced-repetition reinforcement, offline episodic-to-semantic consolidation, and gist-first retrieval. Each mechanism is tied to an observable behavioral signature rather than to a claim of psychological fidelity.</w:t>
+          <w:lang w:val="ka-GE"/>
+        </w:rPr>
+        <w:t>ეს ნაშრომი ამ ხარვეზს დიზაინის, იმპლემენტაციისა და შეფასების მეთოდოლოგიის მეშვეობით ავსებს. ის წარმოადგენს Profile C-ს, ხმოვანი თანამოსაუბრის გრძელვადიანი მეხსიერების არქიტექტურას, რომელიც აერთიანებს ხუთ კოგნიტურ-მეხსიერების თეორიას — ატკინსონ-შიფრინის მრავალსაცავიანი მოდელი, ებინგჰაუსის დავიწყების მრუდი, ტულვინგის ეპიზოდურ-სემანტიკური განასხვავება, ბუნდოვანი კვალით თეორია და დამატებითი სასწავლო სისტემების ჩარჩო — ერთ სასიცოცხლო ციკლში: მნიშვნელობისმიღწევით კონტროლირებადი კოდირება, არსებითი ნაწილისა და ორიენტირის წარმოდგენა, გაჭიანურებული ებინგჰაუსის დაშლა დროში გადანაწილებული გამეორებით გაძლიერებისას, ოფლაინ ეპიზოდურიდან სემანტიკურზე კონსოლიდაცია და არსებითი ნაწილის მიხედვით მოძიება. თითოეული მექანიზმი დაკავშირებულია დასაკვირვებელ ქცევით ხელმოწერასთან და არა ფსიქოლოგიური სიზუსტის მტკიცებასთან.</w:t>
       </w:r>
     </w:p>
     <w:p>
@@ -1111,9 +1111,9 @@
           <w:rFonts w:ascii="Sylfaen" w:hAnsi="Sylfaen" w:cs="Sylfaen"/>
           <w:b w:val="0"/>
           <w:sz w:val="24"/>
-          <w:lang w:val="en-US"/>
-        </w:rPr>
-        <w:t>The central methodological contribution is a curation-controlled experimental design. Profile C is compared not only against a no-memory baseline (A) and verbatim retrieval-augmented memory (B), but against an active control, B+, which receives the same offline language-model gisting and cleanup as C yet none of its human-memory dynamics — no decay, no salience-gating, no consolidation. Because the conditions share an identical inference-time envelope, the B+ control isolates the effect of the human-memory dynamics from the generic legibility gains of language-model curation, the confound that would otherwise render any advantage of a "human-like" memory uninterpretable. An a-priori power analysis shows that the resulting central contrast, C versus B+, is by construction the smallest effect in the design and is not confirmable at the sample size normative for this class of study; it is therefore pre-registered as an estimation target, and a precisely-estimated null is treated as a substantive result that the B+ control was purpose-built to make interpretable.</w:t>
+          <w:lang w:val="ka-GE"/>
+        </w:rPr>
+        <w:t>მთავარი მეთოდოლოგიური წვლილი კურატორირებაზე კონტროლირებადი ექსპერიმენტული დიზაინია. პროფილი C შედარებულია არა მხოლოდ უმეხსიერებო საწყისთან (A) და სიტყვასიტყვითი აღდგენით გაძლიერებულ მეხსიერებასთან (B), არამედ აქტიურ კონტროლთან, B+, რომელიც იღებს იმავე ოფლაინ ენობრივი მოდელის აზრთა არსის გამოყოფასა და გაწმენდას, რასაც C, მაგრამ არ იღებს ადამიანის მეხსიერების დინამიკის არცერთ ელემენტს — არც გახუნებას, არც მნიშვნელოვნების კარიბჭეს, არც კონსოლიდაციას. რადგან პირობებს ერთნაირი, ანალიზის დროის ჩარჩო აქვთ, B+ კონტროლი გამოყოფს ადამიანის მეხსიერების დინამიკის ეფექტს ენობრივი მოდელის კურატორირებით მიღებული ზოგადი წაკითხვადობის გაუმჯობესებისგან — იმ არეულობისგან, რომელიც სხვა შემთხვევაში "ადამიანის მსგავსი" მეხსიერების ნებისმიერ უპირატესობას გაუგებარს გახდიდა. ა-პრიორი ძალის ანალიზი აჩვენებს, რომ მიღებული ცენტრალური კონტრასტი, C B+-თან შედარებით, თავისი კონსტრუქციით, დიზაინში ყველაზე მცირე ეფექტია და არდასტურდება ამ კლასის კვლევისთვის ნორმატიული ნიმუშების რაოდენობით; შესაბამისად, ის წინასწარ არის რეგისტრირებული, როგორც შეფასების სამიზნე, და ზუსტად შეფასებული ნული ითვლება არსებით შედეგად, რომლის ინტერპრეტაციაც B+ კონტროლის მიერ მიზანმიმართულად იქნა უზრუნველყოფილი.</w:t>
       </w:r>
     </w:p>
     <w:p>
@@ -1126,9 +1126,9 @@
           <w:rFonts w:ascii="Sylfaen" w:hAnsi="Sylfaen" w:cs="Sylfaen"/>
           <w:b w:val="0"/>
           <w:sz w:val="24"/>
-          <w:lang w:val="en-US"/>
-        </w:rPr>
-        <w:t>A proof-of-concept harness implements all four conditions over multi-session dialogues and is evaluated on a technical and a simulated-user track. Technically, the mechanisms behave as designed and are distinguishable: only Profile C forgets gracefully and selectively — retaining salient facts while letting trivia fade — and only C consolidates recurring episodes into durable semantic knowledge, at a leaner context footprint and at latency parity with the baselines. In simulation, Profile C does not exceed the B+ control on any perceived construct, corroborating the prediction that human-memory dynamics add little perceptual margin over clean curation. Most consequentially, on the one construct with a strong replicated human effect — the intrusiveness of verbatim recall — the simulated judge produced the opposite ordering to the human literature, demonstrating that a language-model judge cannot substitute for human perception on stakes-dependent constructs, and thereby establishing the necessity of the human-subject study that the thesis fully specifies as future work.</w:t>
+          <w:lang w:val="ka-GE"/>
+        </w:rPr>
+        <w:t>კონცეფციის დამტკიცების მექანიზმი მრავალსესიურ დიალოგებზე ყველა ოთხ პირობას ასრულებს და მისი შეფასება ტექნიკური და სიმულირებული მომხმარებლის მიმართულებით ხდება. ტექნიკურად, მექანიზმები ისე მუშაობს, როგორც დაპროექტდა, და ერთმანეთისგან განასხვავებადია: მხოლოდ პროფილი C ივიწყებს გამართულად და სელექციურად — ინარჩუნებს მნიშვნელოვან ფაქტებს, ხოლო უმნიშვნელო ინფორმაცია მივიწყებას მიეცემა — და მხოლოდ C აერთიანებს განმეორებად ეპიზოდებს მდგრად სემანტიკურ ცოდნედ, უფრო მცირე კონტექსტური კვალის ფასად და საბაზისო მაჩვენებლების მსგავსი შეყოვნებით. სიმულაციისას, პროფილი C არ აღემატება B+ კონტროლს არცერთ აღქმულ კონსტრუქტზე, რაც ადასტურებს პროგნოზს, რომ ადამიანის მეხსიერების დინამიკა სუფთა კურირებასთან შედარებით აღქმის მცირე დამატებით მარჟინს ქმნის. რაც ყველაზე მნიშვნელოვანია, იმ ერთ კონსტრუქტზე, რომელზეც ადამიანის გავლენა ძლიერი და გამეორებული იყო — სიტყვასიტყვითი გახსენების ინტრუზიულობა — სიმულაციურმა მსაჯულმა ადამიანთა ლიტერატურისგან საპირისპირო დალაგება წარმოადგინა, რითაც აჩვენა, რომ ენობრივი მოდელის მსაჯული ვერ ჩაანაცვლებს ადამიანის აღქმას მნიშვნელოვან შედეგებზე დამოკიდებულ კონსტრუქტებზე და, ამგვარად, დაამტკიცა ადამიანთა მონაწილეობით კვლევის აუცილებლობა, რომელსაც ნაშრომი სრულად განსაზღვრავს, როგორც მომავალ სამუშაოს.</w:t>
       </w:r>
     </w:p>
     <w:p>
@@ -1141,9 +1141,9 @@
           <w:rFonts w:ascii="Sylfaen" w:hAnsi="Sylfaen" w:cs="Sylfaen"/>
           <w:b w:val="0"/>
           <w:sz w:val="24"/>
-          <w:lang w:val="en-US"/>
-        </w:rPr>
-        <w:t>The thesis contributes a cognitively-grounded memory architecture, a reusable curation-controlled methodology for separating memory dynamics from curation, and empirical proof-of-concept evidence for both — framing the human-subject evaluation as rigorous, pre-registered future work.</w:t>
+          <w:lang w:val="ka-GE"/>
+        </w:rPr>
+        <w:t>ნაშრომი წარმოადგენს კოგნიტურ-საფუძვლიან მეხსიერების არქიტექტურას, მეხსიერების დინამიკის კურატორირებული შინაარსისგან გამიჯვნის ხელახლა გამოყენებად მეთოდოლოგიას და ემპირიულ კონცეფციის დამამტკიცებელ მტკიცებულებას ორივესთვის — რაც ადამიანზე ორიენტირებულ შეფასებას წარმოაჩენს, როგორც მკაცრ, წინასწარ რეგისტრირებულ სამომავლო სამუშაოს.</w:t>
       </w:r>
     </w:p>
     <w:p>
@@ -1155,9 +1155,9 @@
           <w:rFonts w:ascii="Sylfaen" w:hAnsi="Sylfaen" w:cs="Sylfaen"/>
           <w:b w:val="0"/>
           <w:sz w:val="24"/>
-          <w:lang w:val="en-US"/>
-        </w:rPr>
-        <w:t>Keywords: conversational AI, long-term memory, human memory models, social presence, voice interlocutor, evaluation methodology.</w:t>
+          <w:lang w:val="ka-GE"/>
+        </w:rPr>
+        <w:t>საკვანძო სიტყვები: საუბრული ხელოვნური ინტელექტი, გრძელვადიანი მეხსიერება, ადამიანის მეხსიერების მოდელები, სოციალური თანდასწრება, ხმოვანი თანამოსაუბრე, შეფასების მეთოდოლოგია.</w:t>
       </w:r>
     </w:p>
     <w:p>

</xml_diff>

<commit_message>
polish(abstract): align რეზიუმე to polished body — terminology + honesty verified
- Global term fixes: კურატორირება→კურირება, ქცევით ხელმოწერა→ქცევითი ნიშან-თვისება,
  დამატებითი→კომპლემენტარული, დაშლა→დაქრობა, latency→დაყოვნება, future work→სამომავლო გეგმები
- Five-theory list case-fixed + typos (განასხვავება→განსხვავება, კვალით→კვალის); Latin Profile C→პროფილი C
- ASCII quotes→„…"; inference-time mistranslation fixed; confound→ამრევი ფაქტორი; a-priori power→აპრიორული სიმძლავრის
- All honesty hedges preserved (novelty hedge, smallest-effect/estimation-target/null-as-result, privacy inversion, future human study); no ჩატარებული
- Lands in both thesis-ka (რეზიუმე) and thesis-en (Abstract slot)

Co-Authored-By: Claude Opus 4.8 (1M context) <noreply@anthropic.com>
</commit_message>
<xml_diff>
--- a/project/thesis-en.docx
+++ b/project/thesis-en.docx
@@ -1083,7 +1083,7 @@
           <w:sz w:val="24"/>
           <w:lang w:val="ka-GE"/>
         </w:rPr>
-        <w:t>დიდი ენობრივი მოდელების საფუძველზე შექმნილი საუბრის სისტემები ერთ სესიაზე ადამიანის დონის თავისუფლებას აღწევენ, მაგრამ სესიებს შორის ვერ ინარჩუნებენ უწყვეტ, განვითარებად ურთიერთობას, რადგან მათ არ გააჩნიათ მდგრადი გრძელვადიანი მეხსიერება. გრძელვადიანი მეხსიერების ბენჩმარკებისა და ეგრეთ წოდებული "კომპანიონი" აპლიკაციების მომხმარებლების მონაცემები მიუთითებს, რომ ეს წარუმატებლობა არის როგორც ტექნიკური — მოდელები ადამიანის მეხსიერებას მნიშვნელოვნად ჩამორჩებიან, განსაკუთრებით დროითი (ტემპორალური) მსჯელობისას — ასევე ურთიერთობრივი, რადგან მეხსიერების დეფექტები და იდენტობის მკვეთრი შეწყვეტა დოკუმენტურად არღვევს მომხმარებლის მიერ აღქმულ ურთიერთობას. თუმცა, პრობლემასთან დაკავშირებული ორი დისციპლინა განცალკევებით არსებობს: მეხსიერების არქიტექტურები შეფასდება ფაქტობრივი სიზუსტის კრიტერიუმებით, მაშინ როდესაც ურთიერთობის აღქმის კვლევები მეხსიერებას განიხილავენ, როგორც ერთჯერად ჩართვა-გამორთვას ერთი სისტემის ფარგლებში. ჩვენთვის ხელმისაწვდომ ლიტერატურაში არ არსებობს არც ერთი კონტროლირებადი კვლევა, რომელიც სხვადასხვა ადამიანური მეხსიერების თეორიაზე დაფუძნებული მეხსიერების არქიტექტურების შედარებას ახდენს მომხმარებლის მიერ აღქმული სოციალური კონსტრუქტების მიხედვით და არც ერთი მათგანი არ ათავსებს ასეთ შედარებას ხმოვან მოდალობაში.</w:t>
+        <w:t>დიდი ენობრივი მოდელების საფუძველზე შექმნილი საუბრის სისტემები ერთ სესიაზე ადამიანის დონის თავისუფლებას აღწევს, მაგრამ სესიებს შორის ვერ ინარჩუნებს უწყვეტ, განვითარებად ურთიერთობას, რადგან მათ არ გააჩნიათ მდგრადი გრძელვადიანი მეხსიერება. გრძელვადიანი მეხსიერების ბენჩმარკებისა და ეგრეთ წოდებული „კომპანიონი“ აპლიკაციების მომხმარებლების მონაცემები მიუთითებს, რომ ეს წარუმატებლობა არის როგორც ტექნიკური — მოდელები ადამიანის მეხსიერებას მნიშვნელოვნად ჩამორჩება, განსაკუთრებით დროითი (ტემპორალური) მსჯელობისას — ასევე ურთიერთობრივი, რადგან მეხსიერების დეფექტები და იდენტობის მკვეთრი შეწყვეტა დოკუმენტურად არღვევს მომხმარებლის მიერ აღქმულ ურთიერთობას. თუმცა, პრობლემასთან დაკავშირებული ორი დისციპლინა განცალკევებით არსებობს: მეხსიერების არქიტექტურები ფასდება ფაქტობრივი სიზუსტის კრიტერიუმებით, მაშინ როდესაც ურთიერთობის აღქმის კვლევები მეხსიერებას განიხილავს, როგორც ერთჯერად ჩართვა-გამორთვას ერთი სისტემის ფარგლებში. ჩვენთვის ხელმისაწვდომ ლიტერატურაში არ არსებობს არც ერთი კონტროლირებადი კვლევა, რომელიც სხვადასხვა ადამიანური მეხსიერების თეორიაზე დაფუძნებული მეხსიერების არქიტექტურების შედარებას ახდენს მომხმარებლის მიერ აღქმული სოციალური კონსტრუქტების მიხედვით და არც ერთი მათგანი არ ათავსებს ასეთ შედარებას ხმოვან მოდალობაში.</w:t>
       </w:r>
     </w:p>
     <w:p>
@@ -1098,7 +1098,7 @@
           <w:sz w:val="24"/>
           <w:lang w:val="ka-GE"/>
         </w:rPr>
-        <w:t>ეს ნაშრომი ამ ხარვეზს დიზაინის, იმპლემენტაციისა და შეფასების მეთოდოლოგიის მეშვეობით ავსებს. ის წარმოადგენს Profile C-ს, ხმოვანი თანამოსაუბრის გრძელვადიანი მეხსიერების არქიტექტურას, რომელიც აერთიანებს ხუთ კოგნიტურ-მეხსიერების თეორიას — ატკინსონ-შიფრინის მრავალსაცავიანი მოდელი, ებინგჰაუსის დავიწყების მრუდი, ტულვინგის ეპიზოდურ-სემანტიკური განასხვავება, ბუნდოვანი კვალით თეორია და დამატებითი სასწავლო სისტემების ჩარჩო — ერთ სასიცოცხლო ციკლში: მნიშვნელობისმიღწევით კონტროლირებადი კოდირება, არსებითი ნაწილისა და ორიენტირის წარმოდგენა, გაჭიანურებული ებინგჰაუსის დაშლა დროში გადანაწილებული გამეორებით გაძლიერებისას, ოფლაინ ეპიზოდურიდან სემანტიკურზე კონსოლიდაცია და არსებითი ნაწილის მიხედვით მოძიება. თითოეული მექანიზმი დაკავშირებულია დასაკვირვებელ ქცევით ხელმოწერასთან და არა ფსიქოლოგიური სიზუსტის მტკიცებასთან.</w:t>
+        <w:t>ეს ნაშრომი ამ ხარვეზს დიზაინის, იმპლემენტაციისა და შეფასების მეთოდოლოგიის მეშვეობით ავსებს. ის წარმოადგენს პროფილი C-ს, ხმოვანი თანამოსაუბრის გრძელვადიანი მეხსიერების არქიტექტურას, რომელიც აერთიანებს ხუთ კოგნიტურ-მეხსიერების თეორიას — ატკინსონ-შიფრინის მრავალსაცავიან მოდელს, ებინგჰაუსის დავიწყების მრუდს, ტულვინგის ეპიზოდურ-სემანტიკურ განსხვავებას, ბუნდოვანი კვალის თეორიასა და კომპლემენტარული სასწავლო სისტემების ჩარჩოს — ერთ სასიცოცხლო ციკლში: მნიშვნელობისმიღწევით კონტროლირებადი კოდირება, არსობრივი ნაწილისა და ორიენტირის წარმოდგენა, გადავადებული ებინგჰაუსის დაქრობა დროში გადანაწილებული გამეორებით გაძლიერებისას, ოფლაინ ეპიზოდურიდან სემანტიკურზე კონსოლიდაცია და არსობრივი ნაწილის მიხედვით მოძიება. თითოეული მექანიზმი დაკავშირებულია დასაკვირვებელ ქცევით ნიშან-თვისებასთან და არა ფსიქოლოგიური სიზუსტის მტკიცებასთან.</w:t>
       </w:r>
     </w:p>
     <w:p>
@@ -1113,7 +1113,7 @@
           <w:sz w:val="24"/>
           <w:lang w:val="ka-GE"/>
         </w:rPr>
-        <w:t>მთავარი მეთოდოლოგიური წვლილი კურატორირებაზე კონტროლირებადი ექსპერიმენტული დიზაინია. პროფილი C შედარებულია არა მხოლოდ უმეხსიერებო საწყისთან (A) და სიტყვასიტყვითი აღდგენით გაძლიერებულ მეხსიერებასთან (B), არამედ აქტიურ კონტროლთან, B+, რომელიც იღებს იმავე ოფლაინ ენობრივი მოდელის აზრთა არსის გამოყოფასა და გაწმენდას, რასაც C, მაგრამ არ იღებს ადამიანის მეხსიერების დინამიკის არცერთ ელემენტს — არც გახუნებას, არც მნიშვნელოვნების კარიბჭეს, არც კონსოლიდაციას. რადგან პირობებს ერთნაირი, ანალიზის დროის ჩარჩო აქვთ, B+ კონტროლი გამოყოფს ადამიანის მეხსიერების დინამიკის ეფექტს ენობრივი მოდელის კურატორირებით მიღებული ზოგადი წაკითხვადობის გაუმჯობესებისგან — იმ არეულობისგან, რომელიც სხვა შემთხვევაში "ადამიანის მსგავსი" მეხსიერების ნებისმიერ უპირატესობას გაუგებარს გახდიდა. ა-პრიორი ძალის ანალიზი აჩვენებს, რომ მიღებული ცენტრალური კონტრასტი, C B+-თან შედარებით, თავისი კონსტრუქციით, დიზაინში ყველაზე მცირე ეფექტია და არდასტურდება ამ კლასის კვლევისთვის ნორმატიული ნიმუშების რაოდენობით; შესაბამისად, ის წინასწარ არის რეგისტრირებული, როგორც შეფასების სამიზნე, და ზუსტად შეფასებული ნული ითვლება არსებით შედეგად, რომლის ინტერპრეტაციაც B+ კონტროლის მიერ მიზანმიმართულად იქნა უზრუნველყოფილი.</w:t>
+        <w:t>მთავარი მეთოდოლოგიური წვლილი კურირებაზე კონტროლირებადი ექსპერიმენტული დიზაინია. პროფილი C შედარებულია არა მხოლოდ უმეხსიერებო საწყისთან (A) და სიტყვასიტყვითი აღდგენით გაძლიერებულ მეხსიერებასთან (B), არამედ აქტიურ კონტროლთან, B+, რომელიც იღებს იმავე ოფლაინ ენობრივი მოდელის არსობრივი შინაარსის გამოყოფასა და გაწმენდას, რასაც C, მაგრამ არ იღებს ადამიანის მეხსიერების დინამიკის არცერთ ელემენტს — არც დაქრობას, არც მნიშვნელოვნების კარიბჭეს, არც კონსოლიდაციას. რადგან პირობებს ინფერენსის დროის (inference-time) იდენტური ჩარჩო აქვს, B+ კონტროლი გამოყოფს ადამიანის მეხსიერების დინამიკის ეფექტს ენობრივი მოდელის კურირებით მიღებული ზოგადი წაკითხვადობის გაუმჯობესებისგან — იმ ამრევი ფაქტორისგან, რომელიც სხვა შემთხვევაში „ადამიანის მსგავსი“ მეხსიერების ნებისმიერ უპირატესობას გაუგებარს გახდიდა. აპრიორული სიმძლავრის ანალიზი აჩვენებს, რომ მიღებული ცენტრალური კონტრასტი, C B+-თან შედარებით, თავისი კონსტრუქციით, დიზაინში ყველაზე მცირე ეფექტია და არდასტურდება ამ კლასის კვლევისთვის ნორმატიული ნიმუშების რაოდენობით. შესაბამისად, ის წინასწარ არის რეგისტრირებული, როგორც შეფასების სამიზნე, და ზუსტად შეფასებული ნული ითვლება არსებით შედეგად, რომლის ინტერპრეტაციაც B+ კონტროლის მიერ მიზანმიმართულად იქნა უზრუნველყოფილი.</w:t>
       </w:r>
     </w:p>
     <w:p>
@@ -1128,7 +1128,7 @@
           <w:sz w:val="24"/>
           <w:lang w:val="ka-GE"/>
         </w:rPr>
-        <w:t>კონცეფციის დამტკიცების მექანიზმი მრავალსესიურ დიალოგებზე ყველა ოთხ პირობას ასრულებს და მისი შეფასება ტექნიკური და სიმულირებული მომხმარებლის მიმართულებით ხდება. ტექნიკურად, მექანიზმები ისე მუშაობს, როგორც დაპროექტდა, და ერთმანეთისგან განასხვავებადია: მხოლოდ პროფილი C ივიწყებს გამართულად და სელექციურად — ინარჩუნებს მნიშვნელოვან ფაქტებს, ხოლო უმნიშვნელო ინფორმაცია მივიწყებას მიეცემა — და მხოლოდ C აერთიანებს განმეორებად ეპიზოდებს მდგრად სემანტიკურ ცოდნედ, უფრო მცირე კონტექსტური კვალის ფასად და საბაზისო მაჩვენებლების მსგავსი შეყოვნებით. სიმულაციისას, პროფილი C არ აღემატება B+ კონტროლს არცერთ აღქმულ კონსტრუქტზე, რაც ადასტურებს პროგნოზს, რომ ადამიანის მეხსიერების დინამიკა სუფთა კურირებასთან შედარებით აღქმის მცირე დამატებით მარჟინს ქმნის. რაც ყველაზე მნიშვნელოვანია, იმ ერთ კონსტრუქტზე, რომელზეც ადამიანის გავლენა ძლიერი და გამეორებული იყო — სიტყვასიტყვითი გახსენების ინტრუზიულობა — სიმულაციურმა მსაჯულმა ადამიანთა ლიტერატურისგან საპირისპირო დალაგება წარმოადგინა, რითაც აჩვენა, რომ ენობრივი მოდელის მსაჯული ვერ ჩაანაცვლებს ადამიანის აღქმას მნიშვნელოვან შედეგებზე დამოკიდებულ კონსტრუქტებზე და, ამგვარად, დაამტკიცა ადამიანთა მონაწილეობით კვლევის აუცილებლობა, რომელსაც ნაშრომი სრულად განსაზღვრავს, როგორც მომავალ სამუშაოს.</w:t>
+        <w:t>კონცეფციის დამტკიცების მექანიზმი მრავალსესიურ დიალოგებზე ყველა ოთხ პირობას ასრულებს და მისი შეფასება ტექნიკური და სიმულირებული მომხმარებლის მიმართულებით ხდება. ტექნიკურად, მექანიზმები ისე მუშაობს, როგორც დაპროექტდა, და ერთმანეთისგან განსხვავებადია: მხოლოდ პროფილი C ივიწყებს გამართულად და სელექციურად — ინარჩუნებს მნიშვნელოვან ფაქტებს, ხოლო უმნიშვნელო ინფორმაცია მივიწყებას მიეცემა — და მხოლოდ C აერთიანებს განმეორებად ეპიზოდებს მდგრად სემანტიკურ ცოდნად, უფრო მცირე კონტექსტური კვალის ფასად და საბაზისო მაჩვენებლების მსგავსი დაყოვნებით. სიმულაციისას, პროფილი C არ აღემატება B+ კონტროლს არცერთ აღქმულ კონსტრუქტზე, რაც ადასტურებს პროგნოზს, რომ ადამიანის მეხსიერების დინამიკა სუფთა კურირებასთან შედარებით აღქმის მცირე დამატებით ზღვარს ქმნის. რაც ყველაზე მნიშვნელოვანია, იმ ერთ კონსტრუქტზე, რომელზეც ადამიანის ძლიერი, განმეორებით დადასტურებული ეფექტი არსებობს — სიტყვასიტყვითი გახსენების ინტრუზიულობა — სიმულირებულმა მსაჯულმა ადამიანთა ლიტერატურისგან საპირისპირო დალაგება წარმოადგინა. ეს აჩვენებს, რომ ენობრივი მოდელის მსაჯული ვერ ჩაანაცვლებს ადამიანის აღქმას რისკზე დამოკიდებულ კონსტრუქტებზე, რითაც დასტურდება ადამიანთა მონაწილეობით კვლევის აუცილებლობა, რომელსაც ნაშრომი სრულად განსაზღვრავს, როგორც სამომავლო გეგმებს.</w:t>
       </w:r>
     </w:p>
     <w:p>
@@ -1143,7 +1143,7 @@
           <w:sz w:val="24"/>
           <w:lang w:val="ka-GE"/>
         </w:rPr>
-        <w:t>ნაშრომი წარმოადგენს კოგნიტურ-საფუძვლიან მეხსიერების არქიტექტურას, მეხსიერების დინამიკის კურატორირებული შინაარსისგან გამიჯვნის ხელახლა გამოყენებად მეთოდოლოგიას და ემპირიულ კონცეფციის დამამტკიცებელ მტკიცებულებას ორივესთვის — რაც ადამიანზე ორიენტირებულ შეფასებას წარმოაჩენს, როგორც მკაცრ, წინასწარ რეგისტრირებულ სამომავლო სამუშაოს.</w:t>
+        <w:t>ნაშრომი წარმოადგენს კოგნიტურ-საფუძვლიან მეხსიერების არქიტექტურას, მეხსიერების დინამიკის კურირებული შინაარსისგან გამიჯვნის ხელახლა გამოყენებად მეთოდოლოგიას და კონცეფციის დამტკიცების ემპირიულ მტკიცებულებას ორივესთვის — რაც ადამიანზე ორიენტირებულ შეფასებას წარმოაჩენს, როგორც მკაცრ, წინასწარ რეგისტრირებულ სამომავლო გეგმებს.</w:t>
       </w:r>
     </w:p>
     <w:p>

</xml_diff>